<commit_message>
added 2 pages, hidaka translation
</commit_message>
<xml_diff>
--- a/Bielik Tomáš - Fenomén poklesu nadväzovania partnerských vzťahov u japonskej mládeže a súvisiace sociálne javy.docx
+++ b/Bielik Tomáš - Fenomén poklesu nadväzovania partnerských vzťahov u japonskej mládeže a súvisiace sociálne javy.docx
@@ -3737,6 +3737,118 @@
     <w:p>
       <w:pPr>
         <w:spacing w:line="360" w:lineRule="auto"/>
+        <w:ind w:firstLine="0"/>
+        <w:rPr>
+          <w:rFonts w:eastAsia="Yu Mincho"/>
+        </w:rPr>
+      </w:pPr>
+      <w:r>
+        <w:rPr>
+          <w:rFonts w:eastAsia="Yu Mincho"/>
+        </w:rPr>
+        <w:tab/>
+      </w:r>
+      <w:r>
+        <w:rPr>
+          <w:rFonts w:eastAsia="Yu Mincho"/>
+        </w:rPr>
+        <w:t>Popularita</w:t>
+      </w:r>
+      <w:r>
+        <w:rPr>
+          <w:rFonts w:eastAsia="Yu Mincho"/>
+        </w:rPr>
+        <w:t xml:space="preserve"> tohto výrazu </w:t>
+      </w:r>
+      <w:r>
+        <w:rPr>
+          <w:rFonts w:eastAsia="Yu Mincho"/>
+        </w:rPr>
+        <w:t>viedla k tomu, že sa jeho pôvodný zmysel rozplynul v rôznych interpretáciách.</w:t>
+      </w:r>
+      <w:r>
+        <w:rPr>
+          <w:rFonts w:eastAsia="Yu Mincho"/>
+        </w:rPr>
+        <w:t xml:space="preserve"> </w:t>
+      </w:r>
+      <w:r>
+        <w:rPr>
+          <w:rFonts w:eastAsia="Yu Mincho"/>
+        </w:rPr>
+        <w:t xml:space="preserve">Vrchol slávy zažil tento výraz koncom roka 2009, keď sa prebojoval medzi najvplyvnejšie </w:t>
+      </w:r>
+      <w:r>
+        <w:rPr>
+          <w:rFonts w:eastAsia="Yu Mincho"/>
+        </w:rPr>
+        <w:t>výrazy</w:t>
+      </w:r>
+      <w:r>
+        <w:rPr>
+          <w:rFonts w:eastAsia="Yu Mincho"/>
+        </w:rPr>
+        <w:t xml:space="preserve"> roka. Netrvalo však dlho a jeho výnimočnosť vyprchala</w:t>
+      </w:r>
+      <w:r>
+        <w:rPr>
+          <w:rFonts w:eastAsia="Yu Mincho"/>
+        </w:rPr>
+        <w:t>. V</w:t>
+      </w:r>
+      <w:r>
+        <w:rPr>
+          <w:rFonts w:eastAsia="Yu Mincho"/>
+        </w:rPr>
+        <w:t xml:space="preserve"> roku 2010 sa stal súčasťou bežnej slovnej zásoby</w:t>
+      </w:r>
+      <w:r>
+        <w:rPr>
+          <w:rFonts w:eastAsia="Yu Mincho"/>
+        </w:rPr>
+        <w:t xml:space="preserve"> a</w:t>
+      </w:r>
+      <w:r>
+        <w:rPr>
+          <w:rFonts w:eastAsia="Yu Mincho"/>
+        </w:rPr>
+        <w:t xml:space="preserve"> v roku 2011 už pôsob</w:t>
+      </w:r>
+      <w:r>
+        <w:rPr>
+          <w:rFonts w:eastAsia="Yu Mincho"/>
+        </w:rPr>
+        <w:t>il</w:t>
+      </w:r>
+      <w:r>
+        <w:rPr>
+          <w:rFonts w:eastAsia="Yu Mincho"/>
+        </w:rPr>
+        <w:t xml:space="preserve"> takmer obohran</w:t>
+      </w:r>
+      <w:r>
+        <w:rPr>
+          <w:rFonts w:eastAsia="Yu Mincho"/>
+        </w:rPr>
+        <w:t>e</w:t>
+      </w:r>
+      <w:r>
+        <w:rPr>
+          <w:rFonts w:eastAsia="Yu Mincho"/>
+        </w:rPr>
+        <w:t>.</w:t>
+      </w:r>
+      <w:r>
+        <w:rPr>
+          <w:rStyle w:val="FootnoteReference"/>
+          <w:rFonts w:eastAsia="Yu Mincho"/>
+        </w:rPr>
+        <w:footnoteReference w:id="5"/>
+      </w:r>
+    </w:p>
+    <w:p>
+      <w:pPr>
+        <w:spacing w:line="360" w:lineRule="auto"/>
         <w:ind w:firstLine="720"/>
         <w:rPr>
           <w:rFonts w:eastAsia="Yu Mincho"/>
@@ -3746,6 +3858,7 @@
         <w:rPr>
           <w:rFonts w:eastAsia="Yu Mincho"/>
         </w:rPr>
+        <w:lastRenderedPageBreak/>
         <w:t xml:space="preserve">Morioka (2008, citovaný podľa Ninagawu, 2011) rozdeľuje bylinožravých </w:t>
       </w:r>
       <w:r>
@@ -3824,7 +3937,6 @@
           <w:b/>
           <w:bCs/>
         </w:rPr>
-        <w:lastRenderedPageBreak/>
         <w:t>Skúsený bylinožravec</w:t>
       </w:r>
       <w:r>
@@ -4006,7 +4118,7 @@
           <w:rStyle w:val="FootnoteReference"/>
           <w:rFonts w:eastAsia="Yu Mincho"/>
         </w:rPr>
-        <w:footnoteReference w:id="5"/>
+        <w:footnoteReference w:id="6"/>
       </w:r>
     </w:p>
     <w:p>
@@ -4028,7 +4140,7 @@
           <w:rStyle w:val="FootnoteReference"/>
           <w:rFonts w:eastAsia="Yu Mincho"/>
         </w:rPr>
-        <w:footnoteReference w:id="6"/>
+        <w:footnoteReference w:id="7"/>
       </w:r>
       <w:r>
         <w:rPr>
@@ -4105,7 +4217,14 @@
         <w:rPr>
           <w:rFonts w:eastAsia="Yu Mincho"/>
         </w:rPr>
-        <w:t xml:space="preserve">pomenúva mužov s maskulínnym zovňajškom, no citlivým vnútrom, zatiaľ čo </w:t>
+        <w:t xml:space="preserve">pomenúva mužov s maskulínnym </w:t>
+      </w:r>
+      <w:r>
+        <w:rPr>
+          <w:rFonts w:eastAsia="Yu Mincho"/>
+        </w:rPr>
+        <w:lastRenderedPageBreak/>
+        <w:t xml:space="preserve">zovňajškom, no citlivým vnútrom, zatiaľ čo </w:t>
       </w:r>
       <w:r>
         <w:rPr>
@@ -4174,7 +4293,7 @@
           <w:rStyle w:val="FootnoteReference"/>
           <w:rFonts w:eastAsia="Yu Mincho"/>
         </w:rPr>
-        <w:footnoteReference w:id="7"/>
+        <w:footnoteReference w:id="8"/>
       </w:r>
     </w:p>
     <w:p>
@@ -4208,7 +4327,7 @@
           <w:rStyle w:val="FootnoteReference"/>
           <w:rFonts w:eastAsia="Yu Mincho"/>
         </w:rPr>
-        <w:footnoteReference w:id="8"/>
+        <w:footnoteReference w:id="9"/>
       </w:r>
       <w:r>
         <w:rPr>
@@ -4229,15 +4348,78 @@
         <w:rPr>
           <w:rFonts w:eastAsia="Yu Mincho"/>
         </w:rPr>
-        <w:lastRenderedPageBreak/>
-        <w:t>Podľa Fukasawy sa bylinožraví muži vyznačujú emočnou vyrovnanosťou a absenciou extrémnych citových výkyvov, čo pramení z ich striedmeho prístupu k láske aj nenávisti. K ženám neistupujú primárne ako k sexuálnym objektom, ale vnímajú ich v prvom rade ako ľudské bytosti. To im umožňuje budovať hodnotné priateľstvá založené na vzájomnej sympatii bez nevyhnutného romantického či sexuálneho podtextu. Takýto rešpektujúci a neagresívny prístup k opačnému pohlaviu autorka považuje za prejav vyspelosti v medziľudských vzťahoch.</w:t>
+        <w:t xml:space="preserve">Podľa </w:t>
+      </w:r>
+      <w:r>
+        <w:rPr>
+          <w:rFonts w:eastAsia="Yu Mincho"/>
+        </w:rPr>
+        <w:t>jej pozorovaní</w:t>
+      </w:r>
+      <w:r>
+        <w:rPr>
+          <w:rFonts w:eastAsia="Yu Mincho"/>
+        </w:rPr>
+        <w:t xml:space="preserve"> sa bylinožraví muži vyznačujú emočnou vyrovnanosťou a absenciou extrémnych citových výkyvov, čo pramení z ich striedmeho prístupu k láske aj nenávisti. K ženám ne</w:t>
+      </w:r>
+      <w:r>
+        <w:rPr>
+          <w:rFonts w:eastAsia="Yu Mincho"/>
+        </w:rPr>
+        <w:t>pr</w:t>
+      </w:r>
+      <w:r>
+        <w:rPr>
+          <w:rFonts w:eastAsia="Yu Mincho"/>
+        </w:rPr>
+        <w:t>istupujú primárne ako k sexuálnym objektom, ale vnímajú ich v prvom rade ako ľudské bytosti. To im umožňuje budovať hodnotné priateľstvá založené na vzájomnej sympatii bez nevyhnutného romantického či sexuálneho podtextu. Takýto rešpektujúci a neagresívny prístup k opačnému pohlaviu autorka považuje za prejav vyspelosti v medziľudských vzťahoch.</w:t>
       </w:r>
       <w:r>
         <w:rPr>
           <w:rStyle w:val="FootnoteReference"/>
           <w:rFonts w:eastAsia="Yu Mincho"/>
         </w:rPr>
-        <w:footnoteReference w:id="9"/>
+        <w:footnoteReference w:id="10"/>
+      </w:r>
+    </w:p>
+    <w:p>
+      <w:pPr>
+        <w:spacing w:line="360" w:lineRule="auto"/>
+        <w:ind w:firstLine="720"/>
+        <w:rPr>
+          <w:rFonts w:eastAsia="Yu Mincho"/>
+        </w:rPr>
+      </w:pPr>
+      <w:r>
+        <w:rPr>
+          <w:rFonts w:eastAsia="Yu Mincho"/>
+        </w:rPr>
+        <w:t>Zároveň dodáva, že muži</w:t>
+      </w:r>
+      <w:r>
+        <w:rPr>
+          <w:rFonts w:eastAsia="Yu Mincho"/>
+        </w:rPr>
+        <w:t xml:space="preserve"> </w:t>
+      </w:r>
+      <w:r>
+        <w:rPr>
+          <w:rFonts w:eastAsia="Yu Mincho"/>
+        </w:rPr>
+        <w:t xml:space="preserve">tohto typu </w:t>
+      </w:r>
+      <w:r>
+        <w:rPr>
+          <w:rFonts w:eastAsia="Yu Mincho"/>
+        </w:rPr>
+        <w:t>netrpia nedostatkom šarmu a milostný život im nie je cudzí. To, čo ich však skutočne odlišuje od tradičných predstáv o mužnosti, nie je absencia skúseností, ale skôr ich pasívny prístup. V romantických vzťahoch a sexuálnom živote sa vyhýbajú nátlaku a prenechávajú iniciatívu na druhú stranu.</w:t>
+      </w:r>
+      <w:r>
+        <w:rPr>
+          <w:rStyle w:val="FootnoteReference"/>
+          <w:rFonts w:eastAsia="Yu Mincho"/>
+        </w:rPr>
+        <w:footnoteReference w:id="11"/>
       </w:r>
     </w:p>
     <w:p>
@@ -4260,7 +4442,7 @@
           <w:i/>
           <w:iCs/>
         </w:rPr>
-        <w:t>„Sōshokukei danshi“ wa naze besshōka shita no ka: Danjo byōdō fobia no shiten kara</w:t>
+        <w:t>„Sōshokukei danshi“ wa naze besshōka shita no ka: Danjo byōdō fobia no shiten kara“</w:t>
       </w:r>
       <w:r>
         <w:rPr>
@@ -4268,14 +4450,6 @@
           <w:i/>
           <w:iCs/>
         </w:rPr>
-        <w:t>“</w:t>
-      </w:r>
-      <w:r>
-        <w:rPr>
-          <w:rFonts w:eastAsia="Yu Mincho"/>
-          <w:i/>
-          <w:iCs/>
-        </w:rPr>
         <w:t xml:space="preserve">, </w:t>
       </w:r>
       <w:r>
@@ -4351,6 +4525,7 @@
         <w:rPr>
           <w:rFonts w:eastAsia="Yu Mincho"/>
         </w:rPr>
+        <w:lastRenderedPageBreak/>
         <w:t xml:space="preserve">Džuniči </w:t>
       </w:r>
       <w:r>
@@ -4388,7 +4563,7 @@
           <w:rStyle w:val="FootnoteReference"/>
           <w:rFonts w:eastAsia="Yu Mincho"/>
         </w:rPr>
-        <w:footnoteReference w:id="10"/>
+        <w:footnoteReference w:id="12"/>
       </w:r>
     </w:p>
     <w:p>
@@ -6658,13 +6833,36 @@
         <w:t xml:space="preserve"> </w:t>
       </w:r>
       <w:r>
-        <w:t>NINAGAWA, Kota, 2011. Sōshokukei danshi o yomitoku: Wakamono no ren'aikan [Interpreting "Herbivore Men": Young People's Views on Love and Romance] [online]. Kyoto: Kyoto University of Advanced Science, Masako Kuroki Seminar</w:t>
-      </w:r>
-      <w:r>
-        <w:t>, str. 9</w:t>
-      </w:r>
-      <w:r>
-        <w:t>1</w:t>
+        <w:rPr>
+          <w:rFonts w:eastAsia="Yu Mincho"/>
+        </w:rPr>
+        <w:t xml:space="preserve">MORIOKA, Masahiro, 2011. Sōshokukei danshi no genshōgakuteki kōsatsu [Phenomenological Study of "Herbivore Men"]. </w:t>
+      </w:r>
+      <w:r>
+        <w:rPr>
+          <w:rFonts w:eastAsia="Yu Mincho"/>
+          <w:i/>
+          <w:iCs/>
+        </w:rPr>
+        <w:t>The Review of Life Studies</w:t>
+      </w:r>
+      <w:r>
+        <w:rPr>
+          <w:rFonts w:eastAsia="Yu Mincho"/>
+        </w:rPr>
+        <w:t xml:space="preserve"> [online]</w:t>
+      </w:r>
+      <w:r>
+        <w:rPr>
+          <w:rFonts w:eastAsia="Yu Mincho"/>
+        </w:rPr>
+        <w:t>, str. 13</w:t>
+      </w:r>
+      <w:r>
+        <w:rPr>
+          <w:rFonts w:eastAsia="Yu Mincho"/>
+        </w:rPr>
+        <w:t>.</w:t>
       </w:r>
     </w:p>
   </w:footnote>
@@ -6683,7 +6881,10 @@
         <w:t xml:space="preserve"> </w:t>
       </w:r>
       <w:r>
-        <w:t>Ibid.</w:t>
+        <w:t>NINAGAWA, Kota, 2011. Sōshokukei danshi o yomitoku: Wakamono no ren'aikan [Interpreting "Herbivore Men": Young People's Views on Love and Romance] [online]. Kyoto: Kyoto University of Advanced Science, Masako Kuroki Seminar</w:t>
+      </w:r>
+      <w:r>
+        <w:t>, str. 91</w:t>
       </w:r>
     </w:p>
   </w:footnote>
@@ -6699,7 +6900,10 @@
         <w:footnoteRef/>
       </w:r>
       <w:r>
-        <w:t xml:space="preserve"> Ibid.</w:t>
+        <w:t xml:space="preserve"> </w:t>
+      </w:r>
+      <w:r>
+        <w:t>Ibid.</w:t>
       </w:r>
     </w:p>
   </w:footnote>
@@ -6715,7 +6919,13 @@
         <w:footnoteRef/>
       </w:r>
       <w:r>
-        <w:t xml:space="preserve"> Shibuya, Str. 8</w:t>
+        <w:t xml:space="preserve"> </w:t>
+      </w:r>
+      <w:r>
+        <w:t>NINAGAWA, Kota, 2011. Sōshokukei danshi o yomitoku: Wakamono no ren'aikan [Interpreting "Herbivore Men": Young People's Views on Love and Romance] [online]. Kyoto: Kyoto University of Advanced Science, Masako Kuroki Seminar</w:t>
+      </w:r>
+      <w:r>
+        <w:t>, str. 91</w:t>
       </w:r>
     </w:p>
   </w:footnote>
@@ -6731,11 +6941,75 @@
         <w:footnoteRef/>
       </w:r>
       <w:r>
-        <w:t xml:space="preserve"> Shibuya, str. 10</w:t>
+        <w:t xml:space="preserve"> Shibuya, Str. 8</w:t>
       </w:r>
     </w:p>
   </w:footnote>
   <w:footnote w:id="10">
+    <w:p>
+      <w:pPr>
+        <w:pStyle w:val="FootnoteText"/>
+      </w:pPr>
+      <w:r>
+        <w:rPr>
+          <w:rStyle w:val="FootnoteReference"/>
+        </w:rPr>
+        <w:footnoteRef/>
+      </w:r>
+      <w:r>
+        <w:t xml:space="preserve"> Shibuya, str. 10</w:t>
+      </w:r>
+    </w:p>
+  </w:footnote>
+  <w:footnote w:id="11">
+    <w:p>
+      <w:pPr>
+        <w:pStyle w:val="FootnoteText"/>
+      </w:pPr>
+      <w:r>
+        <w:rPr>
+          <w:rStyle w:val="FootnoteReference"/>
+        </w:rPr>
+        <w:footnoteRef/>
+      </w:r>
+      <w:r>
+        <w:t xml:space="preserve"> </w:t>
+      </w:r>
+      <w:r>
+        <w:rPr>
+          <w:rFonts w:eastAsia="Yu Mincho"/>
+        </w:rPr>
+        <w:t xml:space="preserve">MORIOKA, Masahiro, 2011. Sōshokukei danshi no genshōgakuteki kōsatsu [Phenomenological Study of "Herbivore Men"]. </w:t>
+      </w:r>
+      <w:r>
+        <w:rPr>
+          <w:rFonts w:eastAsia="Yu Mincho"/>
+          <w:i/>
+          <w:iCs/>
+        </w:rPr>
+        <w:t>The Review of Life Studies</w:t>
+      </w:r>
+      <w:r>
+        <w:rPr>
+          <w:rFonts w:eastAsia="Yu Mincho"/>
+        </w:rPr>
+        <w:t xml:space="preserve"> [online]</w:t>
+      </w:r>
+      <w:r>
+        <w:rPr>
+          <w:rFonts w:eastAsia="Yu Mincho"/>
+        </w:rPr>
+        <w:t>, str. 13</w:t>
+      </w:r>
+      <w:r>
+        <w:rPr>
+          <w:rFonts w:eastAsia="Yu Mincho"/>
+        </w:rPr>
+        <w:t>.</w:t>
+      </w:r>
+    </w:p>
+  </w:footnote>
+  <w:footnote w:id="12">
     <w:p>
       <w:pPr>
         <w:pStyle w:val="FootnoteText"/>

</xml_diff>